<commit_message>
Document the other/unknown-breed covariate in the model and re-export drafts
Every fitted model includes a UN covariate (proportion of other or unknown
breeds), which is significant for all traits in Table S1, but the Methods
equation listed only the six named breeds. The equation, term definitions
and breed-composition text now include it, so the paper describes the model
that was actually fitted.

Co-Authored-By: Claude Opus 5.5 <noreply@anthropic.com>
Claude-Session: https://claude.ai/code/session_011pcAjTufrABAdJ2Ewj7SR3
</commit_message>
<xml_diff>
--- a/manuscript/revised/Methane_manuscript_draft6.docx
+++ b/manuscript/revised/Methane_manuscript_draft6.docx
@@ -469,7 +469,7 @@
           <w:b w:val="0"/>
           <w:i w:val="0"/>
         </w:rPr>
-        <w:t>Auxiliary data relating to animal age, breed composition, animal heterosis and recombination loss, and birth and rearing type were also available. The breed proportion of each animal for the six breeds with the greatest number of methane phenotypes (i.e., Belclare, Charolais, Cheviot, Suffolk, Lleyn, and Texel) was also calculated. The general heterosis and recombination loss coefficients for each animal were also included [18, 19]:</w:t>
+        <w:t>Auxiliary data relating to animal age, breed composition, animal heterosis and recombination loss, and birth and rearing type were also available. The breed proportion of each animal for the six breeds with the greatest number of methane phenotypes (i.e., Belclare, Charolais, Cheviot, Suffolk, Lleyn, and Texel) was also calculated, together with the combined proportion of all other or unknown breeds. The general heterosis and recombination loss coefficients for each animal were also included [18, 19]:</w:t>
       </w:r>
     </w:p>
     <w:p>
@@ -821,7 +821,7 @@
           <w:i/>
           <w:sz w:val="23"/>
         </w:rPr>
-        <w:t>y = μ + sex + BR + CL + CV + LY + SU + TX + het + rec + age + BT</w:t>
+        <w:t>y = μ + sex + BR + CL + CV + LY + SU + TX + UN + het + rec + age + BT</w:t>
       </w:r>
       <w:r>
         <w:rPr>
@@ -1022,7 +1022,7 @@
           <w:b w:val="0"/>
           <w:i w:val="0"/>
         </w:rPr>
-        <w:t>), and Texel (</w:t>
+        <w:t>), Texel (</w:t>
       </w:r>
       <w:r>
         <w:rPr>
@@ -1036,7 +1036,38 @@
           <w:b w:val="0"/>
           <w:i w:val="0"/>
         </w:rPr>
-        <w:t xml:space="preserve">) were included as covariates; </w:t>
+        <w:t xml:space="preserve">), </w:t>
+      </w:r>
+      <w:r>
+        <w:rPr>
+          <w:b w:val="0"/>
+          <w:i w:val="0"/>
+          <w:highlight w:val="yellow"/>
+        </w:rPr>
+        <w:t>and the combined proportion of all other or unknown breeds (</w:t>
+      </w:r>
+      <w:r>
+        <w:rPr>
+          <w:b w:val="0"/>
+          <w:i/>
+          <w:highlight w:val="yellow"/>
+        </w:rPr>
+        <w:t>UN</w:t>
+      </w:r>
+      <w:r>
+        <w:rPr>
+          <w:b w:val="0"/>
+          <w:i w:val="0"/>
+          <w:highlight w:val="yellow"/>
+        </w:rPr>
+        <w:t>)</w:t>
+      </w:r>
+      <w:r>
+        <w:rPr>
+          <w:b w:val="0"/>
+          <w:i w:val="0"/>
+        </w:rPr>
+        <w:t xml:space="preserve">, were included as covariates; </w:t>
       </w:r>
       <w:r>
         <w:rPr>

</xml_diff>